<commit_message>
TP2: Implémente la liste des conteneurs Docker avec Session et timeout
</commit_message>
<xml_diff>
--- a/TP2-api-rest.docx
+++ b/TP2-api-rest.docx
@@ -101,7 +101,23 @@
     <w:p/>
     <w:p>
       <w:r>
-        <w:t>Installation de la librarie requests :</w:t>
+        <w:t xml:space="preserve">Installation de la </w:t>
+      </w:r>
+      <w:proofErr w:type="spellStart"/>
+      <w:r>
+        <w:t>librarie</w:t>
+      </w:r>
+      <w:proofErr w:type="spellEnd"/>
+      <w:r>
+        <w:t xml:space="preserve"> </w:t>
+      </w:r>
+      <w:proofErr w:type="spellStart"/>
+      <w:r>
+        <w:t>requests</w:t>
+      </w:r>
+      <w:proofErr w:type="spellEnd"/>
+      <w:r>
+        <w:t> :</w:t>
       </w:r>
     </w:p>
     <w:p>
@@ -188,6 +204,66 @@
         </w:drawing>
       </w:r>
     </w:p>
+    <w:p>
+      <w:r>
+        <w:t>Création du inventaire.py permettant de lister les conteneurs</w:t>
+      </w:r>
+      <w:r>
+        <w:t xml:space="preserve"> avec sessions et timeout</w:t>
+      </w:r>
+      <w:r>
+        <w:t xml:space="preserve">. </w:t>
+      </w:r>
+      <w:proofErr w:type="spellStart"/>
+      <w:r>
+        <w:t>Execution</w:t>
+      </w:r>
+      <w:proofErr w:type="spellEnd"/>
+      <w:r>
+        <w:t xml:space="preserve"> du programme : </w:t>
+      </w:r>
+    </w:p>
+    <w:p>
+      <w:r>
+        <w:lastRenderedPageBreak/>
+        <w:drawing>
+          <wp:inline distT="0" distB="0" distL="0" distR="0" wp14:anchorId="6A82D6E5" wp14:editId="549CB3C3">
+            <wp:extent cx="5760720" cy="1421765"/>
+            <wp:effectExtent l="0" t="0" r="0" b="6985"/>
+            <wp:docPr id="1746675050" name="Image 1"/>
+            <wp:cNvGraphicFramePr>
+              <a:graphicFrameLocks xmlns:a="http://schemas.openxmlformats.org/drawingml/2006/main" noChangeAspect="1"/>
+            </wp:cNvGraphicFramePr>
+            <a:graphic xmlns:a="http://schemas.openxmlformats.org/drawingml/2006/main">
+              <a:graphicData uri="http://schemas.openxmlformats.org/drawingml/2006/picture">
+                <pic:pic xmlns:pic="http://schemas.openxmlformats.org/drawingml/2006/picture">
+                  <pic:nvPicPr>
+                    <pic:cNvPr id="1746675050" name=""/>
+                    <pic:cNvPicPr/>
+                  </pic:nvPicPr>
+                  <pic:blipFill>
+                    <a:blip r:embed="rId8"/>
+                    <a:stretch>
+                      <a:fillRect/>
+                    </a:stretch>
+                  </pic:blipFill>
+                  <pic:spPr>
+                    <a:xfrm>
+                      <a:off x="0" y="0"/>
+                      <a:ext cx="5760720" cy="1421765"/>
+                    </a:xfrm>
+                    <a:prstGeom prst="rect">
+                      <a:avLst/>
+                    </a:prstGeom>
+                  </pic:spPr>
+                </pic:pic>
+              </a:graphicData>
+            </a:graphic>
+          </wp:inline>
+        </w:drawing>
+      </w:r>
+    </w:p>
+    <w:p/>
     <w:sectPr>
       <w:pgSz w:w="11906" w:h="16838"/>
       <w:pgMar w:top="1417" w:right="1417" w:bottom="1417" w:left="1417" w:header="708" w:footer="708" w:gutter="0"/>

</xml_diff>

<commit_message>
TP2: Calcule et affiche le pourcentage CPU et la mémoire des conteneurs actifs
</commit_message>
<xml_diff>
--- a/TP2-api-rest.docx
+++ b/TP2-api-rest.docx
@@ -251,6 +251,79 @@
                     <a:xfrm>
                       <a:off x="0" y="0"/>
                       <a:ext cx="5760720" cy="1421765"/>
+                    </a:xfrm>
+                    <a:prstGeom prst="rect">
+                      <a:avLst/>
+                    </a:prstGeom>
+                  </pic:spPr>
+                </pic:pic>
+              </a:graphicData>
+            </a:graphic>
+          </wp:inline>
+        </w:drawing>
+      </w:r>
+    </w:p>
+    <w:p>
+      <w:r>
+        <w:t xml:space="preserve">Maintenant on modifie notre code pour </w:t>
+      </w:r>
+      <w:r>
+        <w:t xml:space="preserve">parcourir la liste des conteneurs, et pour chaque conteneur qui est en cours d'exécution (running), d'interroger </w:t>
+      </w:r>
+      <w:proofErr w:type="spellStart"/>
+      <w:r>
+        <w:t>l'endpoint</w:t>
+      </w:r>
+      <w:proofErr w:type="spellEnd"/>
+      <w:r>
+        <w:t xml:space="preserve"> /containers/{id}/</w:t>
+      </w:r>
+      <w:proofErr w:type="spellStart"/>
+      <w:proofErr w:type="gramStart"/>
+      <w:r>
+        <w:t>stats?</w:t>
+      </w:r>
+      <w:proofErr w:type="gramEnd"/>
+      <w:r>
+        <w:t>stream</w:t>
+      </w:r>
+      <w:proofErr w:type="spellEnd"/>
+      <w:r>
+        <w:t xml:space="preserve">=false afin de calculer son pourcentage d'utilisation CPU et sa mémoire </w:t>
+      </w:r>
+    </w:p>
+    <w:p>
+      <w:r>
+        <w:t>On relance ainsi le python :</w:t>
+      </w:r>
+    </w:p>
+    <w:p>
+      <w:r>
+        <w:drawing>
+          <wp:inline distT="0" distB="0" distL="0" distR="0" wp14:anchorId="5222C072" wp14:editId="5860DFC1">
+            <wp:extent cx="5760720" cy="2416810"/>
+            <wp:effectExtent l="0" t="0" r="0" b="2540"/>
+            <wp:docPr id="613387373" name="Image 1"/>
+            <wp:cNvGraphicFramePr>
+              <a:graphicFrameLocks xmlns:a="http://schemas.openxmlformats.org/drawingml/2006/main" noChangeAspect="1"/>
+            </wp:cNvGraphicFramePr>
+            <a:graphic xmlns:a="http://schemas.openxmlformats.org/drawingml/2006/main">
+              <a:graphicData uri="http://schemas.openxmlformats.org/drawingml/2006/picture">
+                <pic:pic xmlns:pic="http://schemas.openxmlformats.org/drawingml/2006/picture">
+                  <pic:nvPicPr>
+                    <pic:cNvPr id="613387373" name=""/>
+                    <pic:cNvPicPr/>
+                  </pic:nvPicPr>
+                  <pic:blipFill>
+                    <a:blip r:embed="rId9"/>
+                    <a:stretch>
+                      <a:fillRect/>
+                    </a:stretch>
+                  </pic:blipFill>
+                  <pic:spPr>
+                    <a:xfrm>
+                      <a:off x="0" y="0"/>
+                      <a:ext cx="5760720" cy="2416810"/>
                     </a:xfrm>
                     <a:prstGeom prst="rect">
                       <a:avLst/>
@@ -877,7 +950,6 @@
   <w:style w:type="character" w:default="1" w:styleId="Policepardfaut">
     <w:name w:val="Default Paragraph Font"/>
     <w:uiPriority w:val="1"/>
-    <w:semiHidden/>
     <w:unhideWhenUsed/>
   </w:style>
   <w:style w:type="table" w:default="1" w:styleId="TableauNormal">

</xml_diff>

<commit_message>
TP2: Écrit l'inventaire dans inventaire.json avec la date et affiche un résumé
</commit_message>
<xml_diff>
--- a/TP2-api-rest.docx
+++ b/TP2-api-rest.docx
@@ -336,6 +336,144 @@
         </w:drawing>
       </w:r>
     </w:p>
+    <w:p>
+      <w:r>
+        <w:t xml:space="preserve">On remodifie ensuite le code pour </w:t>
+      </w:r>
+      <w:r>
+        <w:t xml:space="preserve">qu’un fichier </w:t>
+      </w:r>
+      <w:proofErr w:type="spellStart"/>
+      <w:proofErr w:type="gramStart"/>
+      <w:r>
+        <w:t>inventaire.json</w:t>
+      </w:r>
+      <w:proofErr w:type="spellEnd"/>
+      <w:proofErr w:type="gramEnd"/>
+      <w:r>
+        <w:t xml:space="preserve"> se créer avec la date du relevé et le suivi de l’affichage d’un résumé lisible</w:t>
+      </w:r>
+    </w:p>
+    <w:p>
+      <w:r>
+        <w:drawing>
+          <wp:inline distT="0" distB="0" distL="0" distR="0" wp14:anchorId="5BE5C5CE" wp14:editId="18E2585D">
+            <wp:extent cx="5578323" cy="1836579"/>
+            <wp:effectExtent l="0" t="0" r="3810" b="0"/>
+            <wp:docPr id="2071606553" name="Image 1"/>
+            <wp:cNvGraphicFramePr>
+              <a:graphicFrameLocks xmlns:a="http://schemas.openxmlformats.org/drawingml/2006/main" noChangeAspect="1"/>
+            </wp:cNvGraphicFramePr>
+            <a:graphic xmlns:a="http://schemas.openxmlformats.org/drawingml/2006/main">
+              <a:graphicData uri="http://schemas.openxmlformats.org/drawingml/2006/picture">
+                <pic:pic xmlns:pic="http://schemas.openxmlformats.org/drawingml/2006/picture">
+                  <pic:nvPicPr>
+                    <pic:cNvPr id="2071606553" name=""/>
+                    <pic:cNvPicPr/>
+                  </pic:nvPicPr>
+                  <pic:blipFill>
+                    <a:blip r:embed="rId10"/>
+                    <a:stretch>
+                      <a:fillRect/>
+                    </a:stretch>
+                  </pic:blipFill>
+                  <pic:spPr>
+                    <a:xfrm>
+                      <a:off x="0" y="0"/>
+                      <a:ext cx="5578323" cy="1836579"/>
+                    </a:xfrm>
+                    <a:prstGeom prst="rect">
+                      <a:avLst/>
+                    </a:prstGeom>
+                  </pic:spPr>
+                </pic:pic>
+              </a:graphicData>
+            </a:graphic>
+          </wp:inline>
+        </w:drawing>
+      </w:r>
+    </w:p>
+    <w:p/>
+    <w:p>
+      <w:r>
+        <w:drawing>
+          <wp:inline distT="0" distB="0" distL="0" distR="0" wp14:anchorId="66A2908B" wp14:editId="4AAE3F61">
+            <wp:extent cx="5760720" cy="537210"/>
+            <wp:effectExtent l="0" t="0" r="0" b="0"/>
+            <wp:docPr id="1703756975" name="Image 1"/>
+            <wp:cNvGraphicFramePr>
+              <a:graphicFrameLocks xmlns:a="http://schemas.openxmlformats.org/drawingml/2006/main" noChangeAspect="1"/>
+            </wp:cNvGraphicFramePr>
+            <a:graphic xmlns:a="http://schemas.openxmlformats.org/drawingml/2006/main">
+              <a:graphicData uri="http://schemas.openxmlformats.org/drawingml/2006/picture">
+                <pic:pic xmlns:pic="http://schemas.openxmlformats.org/drawingml/2006/picture">
+                  <pic:nvPicPr>
+                    <pic:cNvPr id="1703756975" name=""/>
+                    <pic:cNvPicPr/>
+                  </pic:nvPicPr>
+                  <pic:blipFill>
+                    <a:blip r:embed="rId11"/>
+                    <a:stretch>
+                      <a:fillRect/>
+                    </a:stretch>
+                  </pic:blipFill>
+                  <pic:spPr>
+                    <a:xfrm>
+                      <a:off x="0" y="0"/>
+                      <a:ext cx="5760720" cy="537210"/>
+                    </a:xfrm>
+                    <a:prstGeom prst="rect">
+                      <a:avLst/>
+                    </a:prstGeom>
+                  </pic:spPr>
+                </pic:pic>
+              </a:graphicData>
+            </a:graphic>
+          </wp:inline>
+        </w:drawing>
+      </w:r>
+    </w:p>
+    <w:p>
+      <w:r>
+        <w:lastRenderedPageBreak/>
+        <w:drawing>
+          <wp:inline distT="0" distB="0" distL="0" distR="0" wp14:anchorId="192E5731" wp14:editId="2B7047A8">
+            <wp:extent cx="5760720" cy="7066915"/>
+            <wp:effectExtent l="0" t="0" r="0" b="635"/>
+            <wp:docPr id="725324314" name="Image 1"/>
+            <wp:cNvGraphicFramePr>
+              <a:graphicFrameLocks xmlns:a="http://schemas.openxmlformats.org/drawingml/2006/main" noChangeAspect="1"/>
+            </wp:cNvGraphicFramePr>
+            <a:graphic xmlns:a="http://schemas.openxmlformats.org/drawingml/2006/main">
+              <a:graphicData uri="http://schemas.openxmlformats.org/drawingml/2006/picture">
+                <pic:pic xmlns:pic="http://schemas.openxmlformats.org/drawingml/2006/picture">
+                  <pic:nvPicPr>
+                    <pic:cNvPr id="725324314" name=""/>
+                    <pic:cNvPicPr/>
+                  </pic:nvPicPr>
+                  <pic:blipFill>
+                    <a:blip r:embed="rId12"/>
+                    <a:stretch>
+                      <a:fillRect/>
+                    </a:stretch>
+                  </pic:blipFill>
+                  <pic:spPr>
+                    <a:xfrm>
+                      <a:off x="0" y="0"/>
+                      <a:ext cx="5760720" cy="7066915"/>
+                    </a:xfrm>
+                    <a:prstGeom prst="rect">
+                      <a:avLst/>
+                    </a:prstGeom>
+                  </pic:spPr>
+                </pic:pic>
+              </a:graphicData>
+            </a:graphic>
+          </wp:inline>
+        </w:drawing>
+      </w:r>
+    </w:p>
+    <w:p/>
     <w:p/>
     <w:sectPr>
       <w:pgSz w:w="11906" w:h="16838"/>

</xml_diff>

<commit_message>
TP2: Ajoute les relevés NetBox (version et pagination des object-types) dans l'inventaire
</commit_message>
<xml_diff>
--- a/TP2-api-rest.docx
+++ b/TP2-api-rest.docx
@@ -461,6 +461,109 @@
                     <a:xfrm>
                       <a:off x="0" y="0"/>
                       <a:ext cx="5760720" cy="7066915"/>
+                    </a:xfrm>
+                    <a:prstGeom prst="rect">
+                      <a:avLst/>
+                    </a:prstGeom>
+                  </pic:spPr>
+                </pic:pic>
+              </a:graphicData>
+            </a:graphic>
+          </wp:inline>
+        </w:drawing>
+      </w:r>
+    </w:p>
+    <w:p/>
+    <w:p>
+      <w:r>
+        <w:t xml:space="preserve">Nous modifions notre code pour </w:t>
+      </w:r>
+      <w:r>
+        <w:t xml:space="preserve">l'ajout des relevés de l'API </w:t>
+      </w:r>
+      <w:proofErr w:type="spellStart"/>
+      <w:r>
+        <w:t>NetBox</w:t>
+      </w:r>
+      <w:proofErr w:type="spellEnd"/>
+      <w:r>
+        <w:t xml:space="preserve"> dans notre inventaire, incluant sa version (/api/</w:t>
+      </w:r>
+      <w:proofErr w:type="spellStart"/>
+      <w:r>
+        <w:t>status</w:t>
+      </w:r>
+      <w:proofErr w:type="spellEnd"/>
+      <w:r>
+        <w:t>/) et le comptage complet des types d'objets en suivant la pagination (/api/</w:t>
+      </w:r>
+      <w:proofErr w:type="spellStart"/>
+      <w:r>
+        <w:t>core</w:t>
+      </w:r>
+      <w:proofErr w:type="spellEnd"/>
+      <w:r>
+        <w:t>/</w:t>
+      </w:r>
+      <w:proofErr w:type="spellStart"/>
+      <w:r>
+        <w:t>object</w:t>
+      </w:r>
+      <w:proofErr w:type="spellEnd"/>
+      <w:r>
+        <w:t>-types</w:t>
+      </w:r>
+      <w:proofErr w:type="gramStart"/>
+      <w:r>
+        <w:t>/?</w:t>
+      </w:r>
+      <w:proofErr w:type="spellStart"/>
+      <w:proofErr w:type="gramEnd"/>
+      <w:r>
+        <w:t>limit</w:t>
+      </w:r>
+      <w:proofErr w:type="spellEnd"/>
+      <w:r>
+        <w:t xml:space="preserve">=50 jusqu'à ce que </w:t>
+      </w:r>
+      <w:proofErr w:type="spellStart"/>
+      <w:r>
+        <w:t>next</w:t>
+      </w:r>
+      <w:proofErr w:type="spellEnd"/>
+      <w:r>
+        <w:t xml:space="preserve"> soit None).</w:t>
+      </w:r>
+    </w:p>
+    <w:p/>
+    <w:p>
+      <w:r>
+        <w:lastRenderedPageBreak/>
+        <w:drawing>
+          <wp:inline distT="0" distB="0" distL="0" distR="0" wp14:anchorId="38E12356" wp14:editId="30156120">
+            <wp:extent cx="5113463" cy="1386960"/>
+            <wp:effectExtent l="0" t="0" r="0" b="3810"/>
+            <wp:docPr id="1014664567" name="Image 1"/>
+            <wp:cNvGraphicFramePr>
+              <a:graphicFrameLocks xmlns:a="http://schemas.openxmlformats.org/drawingml/2006/main" noChangeAspect="1"/>
+            </wp:cNvGraphicFramePr>
+            <a:graphic xmlns:a="http://schemas.openxmlformats.org/drawingml/2006/main">
+              <a:graphicData uri="http://schemas.openxmlformats.org/drawingml/2006/picture">
+                <pic:pic xmlns:pic="http://schemas.openxmlformats.org/drawingml/2006/picture">
+                  <pic:nvPicPr>
+                    <pic:cNvPr id="1014664567" name=""/>
+                    <pic:cNvPicPr/>
+                  </pic:nvPicPr>
+                  <pic:blipFill>
+                    <a:blip r:embed="rId13"/>
+                    <a:stretch>
+                      <a:fillRect/>
+                    </a:stretch>
+                  </pic:blipFill>
+                  <pic:spPr>
+                    <a:xfrm>
+                      <a:off x="0" y="0"/>
+                      <a:ext cx="5113463" cy="1386960"/>
                     </a:xfrm>
                     <a:prstGeom prst="rect">
                       <a:avLst/>

</xml_diff>

<commit_message>
TP2: Rend le script robuste face aux pannes de l'API Docker avec sys.exit
</commit_message>
<xml_diff>
--- a/TP2-api-rest.docx
+++ b/TP2-api-rest.docx
@@ -577,6 +577,112 @@
       </w:r>
     </w:p>
     <w:p/>
+    <w:p>
+      <w:r>
+        <w:t xml:space="preserve">Maintenant nous allons le rendre plus robuste : </w:t>
+      </w:r>
+      <w:r>
+        <w:t xml:space="preserve">L'objectif est de rendre le script capable de réagir proprement si l'API Docker est injoignable (par exemple si elle est arrêtée), en affichant un message d'erreur explicite et en quittant le programme avec un code de retour non nul (grâce à </w:t>
+      </w:r>
+      <w:proofErr w:type="spellStart"/>
+      <w:proofErr w:type="gramStart"/>
+      <w:r>
+        <w:t>sys.exit</w:t>
+      </w:r>
+      <w:proofErr w:type="spellEnd"/>
+      <w:proofErr w:type="gramEnd"/>
+      <w:r>
+        <w:t xml:space="preserve">()). </w:t>
+      </w:r>
+    </w:p>
+    <w:p>
+      <w:r>
+        <w:t>On remodifie le code puis on arrête docker pour le test :</w:t>
+      </w:r>
+    </w:p>
+    <w:p>
+      <w:r>
+        <w:drawing>
+          <wp:inline distT="0" distB="0" distL="0" distR="0" wp14:anchorId="2942C7A5" wp14:editId="01F1C143">
+            <wp:extent cx="5204911" cy="579170"/>
+            <wp:effectExtent l="0" t="0" r="0" b="0"/>
+            <wp:docPr id="1869476139" name="Image 1"/>
+            <wp:cNvGraphicFramePr>
+              <a:graphicFrameLocks xmlns:a="http://schemas.openxmlformats.org/drawingml/2006/main" noChangeAspect="1"/>
+            </wp:cNvGraphicFramePr>
+            <a:graphic xmlns:a="http://schemas.openxmlformats.org/drawingml/2006/main">
+              <a:graphicData uri="http://schemas.openxmlformats.org/drawingml/2006/picture">
+                <pic:pic xmlns:pic="http://schemas.openxmlformats.org/drawingml/2006/picture">
+                  <pic:nvPicPr>
+                    <pic:cNvPr id="1869476139" name=""/>
+                    <pic:cNvPicPr/>
+                  </pic:nvPicPr>
+                  <pic:blipFill>
+                    <a:blip r:embed="rId14"/>
+                    <a:stretch>
+                      <a:fillRect/>
+                    </a:stretch>
+                  </pic:blipFill>
+                  <pic:spPr>
+                    <a:xfrm>
+                      <a:off x="0" y="0"/>
+                      <a:ext cx="5204911" cy="579170"/>
+                    </a:xfrm>
+                    <a:prstGeom prst="rect">
+                      <a:avLst/>
+                    </a:prstGeom>
+                  </pic:spPr>
+                </pic:pic>
+              </a:graphicData>
+            </a:graphic>
+          </wp:inline>
+        </w:drawing>
+      </w:r>
+    </w:p>
+    <w:p>
+      <w:r>
+        <w:t>On relance ensuite notre script python :</w:t>
+      </w:r>
+    </w:p>
+    <w:p>
+      <w:r>
+        <w:drawing>
+          <wp:inline distT="0" distB="0" distL="0" distR="0" wp14:anchorId="516FDA3A" wp14:editId="0C0AEE31">
+            <wp:extent cx="5760720" cy="303530"/>
+            <wp:effectExtent l="0" t="0" r="0" b="1270"/>
+            <wp:docPr id="1327746523" name="Image 1"/>
+            <wp:cNvGraphicFramePr>
+              <a:graphicFrameLocks xmlns:a="http://schemas.openxmlformats.org/drawingml/2006/main" noChangeAspect="1"/>
+            </wp:cNvGraphicFramePr>
+            <a:graphic xmlns:a="http://schemas.openxmlformats.org/drawingml/2006/main">
+              <a:graphicData uri="http://schemas.openxmlformats.org/drawingml/2006/picture">
+                <pic:pic xmlns:pic="http://schemas.openxmlformats.org/drawingml/2006/picture">
+                  <pic:nvPicPr>
+                    <pic:cNvPr id="1327746523" name=""/>
+                    <pic:cNvPicPr/>
+                  </pic:nvPicPr>
+                  <pic:blipFill>
+                    <a:blip r:embed="rId15"/>
+                    <a:stretch>
+                      <a:fillRect/>
+                    </a:stretch>
+                  </pic:blipFill>
+                  <pic:spPr>
+                    <a:xfrm>
+                      <a:off x="0" y="0"/>
+                      <a:ext cx="5760720" cy="303530"/>
+                    </a:xfrm>
+                    <a:prstGeom prst="rect">
+                      <a:avLst/>
+                    </a:prstGeom>
+                  </pic:spPr>
+                </pic:pic>
+              </a:graphicData>
+            </a:graphic>
+          </wp:inline>
+        </w:drawing>
+      </w:r>
+    </w:p>
     <w:p/>
     <w:sectPr>
       <w:pgSz w:w="11906" w:h="16838"/>

</xml_diff>